<commit_message>
added the paper with the final_sub
</commit_message>
<xml_diff>
--- a/paper/TrustFin_Conference_Paper_IEEE.docx
+++ b/paper/TrustFin_Conference_Paper_IEEE.docx
@@ -21,6 +21,16 @@
     </w:p>
     <w:p>
       <w:pPr>
+        <w:pStyle w:val="Author"/>
+      </w:pPr>
+    </w:p>
+    <w:p>
+      <w:pPr>
+        <w:pStyle w:val="Author"/>
+      </w:pPr>
+    </w:p>
+    <w:p>
+      <w:pPr>
         <w:pStyle w:val="AbstractTitle"/>
       </w:pPr>
       <w:r>
@@ -390,18 +400,7 @@
         <w:t xml:space="preserve"> </w:t>
       </w:r>
       <w:r>
-        <w:t xml:space="preserve">model: execution-verified selection does not beat the greedy baseline (Table </w:t>
-      </w:r>
-      <w:hyperlink w:anchor="_97a02e71e75ed989c4fd06271d7d4643470371a">
-        <w:r>
-          <w:rPr>
-            <w:rStyle w:val="Hyperlink"/>
-          </w:rPr>
-          <w:t xml:space="preserve">1</w:t>
-        </w:r>
-      </w:hyperlink>
-      <w:r>
-        <w:t xml:space="preserve">).</w:t>
+        <w:t xml:space="preserve">model: execution-verified selection does not beat the greedy baseline (Table IV).</w:t>
       </w:r>
       <w:r>
         <w:t xml:space="preserve"> </w:t>
@@ -419,18 +418,7 @@
         <w:t xml:space="preserve"> </w:t>
       </w:r>
       <w:r>
-        <w:t xml:space="preserve">by 31% at 80% coverage (Table </w:t>
-      </w:r>
-      <w:hyperlink w:anchor="_16a848194123a7387559aaf877a1bbf043d1f4c">
-        <w:r>
-          <w:rPr>
-            <w:rStyle w:val="Hyperlink"/>
-          </w:rPr>
-          <w:t xml:space="preserve">[tab:transfer]</w:t>
-        </w:r>
-      </w:hyperlink>
-      <w:r>
-        <w:t xml:space="preserve">).</w:t>
+        <w:t xml:space="preserve">by 31% at 80% coverage (Table VII).</w:t>
       </w:r>
     </w:p>
     <w:p>
@@ -578,7 +566,7 @@
     </w:p>
     <w:p>
       <w:pPr>
-        <w:pStyle w:val="Heading4"/>
+        <w:pStyle w:val="Heading2"/>
       </w:pPr>
       <w:bookmarkStart w:id="11" w:name="_f4e716e861c5161f637d656e68cb193348a6f6e"/>
       <w:r>
@@ -650,7 +638,7 @@
     </w:p>
     <w:p>
       <w:pPr>
-        <w:pStyle w:val="Heading4"/>
+        <w:pStyle w:val="Heading2"/>
       </w:pPr>
       <w:bookmarkStart w:id="12" w:name="_c8892b1a1c392f7604ce834059f1898f3d708a5"/>
       <w:r>
@@ -728,7 +716,7 @@
     </w:p>
     <w:p>
       <w:pPr>
-        <w:pStyle w:val="Heading4"/>
+        <w:pStyle w:val="Heading2"/>
       </w:pPr>
       <w:bookmarkStart w:id="13" w:name="_5bd5464acbe53bb2d25abf19e7c9086750eff0f"/>
       <w:r>
@@ -795,7 +783,7 @@
     </w:p>
     <w:p>
       <w:pPr>
-        <w:pStyle w:val="Heading4"/>
+        <w:pStyle w:val="Heading2"/>
       </w:pPr>
       <w:bookmarkStart w:id="14" w:name="_61c7d091cc76e5ff9f940de7aaa392b6c3b56ba"/>
       <w:r>
@@ -849,7 +837,7 @@
     </w:p>
     <w:p>
       <w:pPr>
-        <w:pStyle w:val="Heading4"/>
+        <w:pStyle w:val="Heading2"/>
       </w:pPr>
       <w:bookmarkStart w:id="15" w:name="_23a128e7f9d49d2f86fba142af360209233b302"/>
       <w:r>
@@ -942,21 +930,6 @@
         <w:t xml:space="preserve"> </w:t>
       </w:r>
       <w:r>
-        <w:t xml:space="preserve"> </w:t>
-      </w:r>
-      <w:r>
-        <w:t xml:space="preserve">and a knowledge-graph-constrained</w:t>
-      </w:r>
-      <w:r>
-        <w:t xml:space="preserve"> </w:t>
-      </w:r>
-      <w:r>
-        <w:t xml:space="preserve">abstention policy for unanswerable queries</w:t>
-      </w:r>
-      <w:r>
-        <w:t xml:space="preserve"> </w:t>
-      </w:r>
-      <w:r>
         <w:t xml:space="preserve">; verifiable chain-of-thought for</w:t>
       </w:r>
       <w:r>
@@ -1039,7 +1012,7 @@
     </w:p>
     <w:p>
       <w:pPr>
-        <w:pStyle w:val="Heading4"/>
+        <w:pStyle w:val="Heading2"/>
       </w:pPr>
       <w:bookmarkStart w:id="17" w:name="_2e30b014c75f87e075100cb69ef543a074bf23d"/>
       <w:r>
@@ -1268,7 +1241,7 @@
     </w:p>
     <w:p>
       <w:pPr>
-        <w:pStyle w:val="Heading4"/>
+        <w:pStyle w:val="Heading2"/>
       </w:pPr>
       <w:bookmarkStart w:id="18" w:name="_a31da257db47ac5db6a6d90281a026c1a35041b"/>
       <w:r>
@@ -1370,7 +1343,7 @@
         <w:t xml:space="preserve"> </w:t>
       </w:r>
       <w:r>
-        <w:t xml:space="preserve">documented in $6 of</w:t>
+        <w:t xml:space="preserve">documented in §6 of</w:t>
       </w:r>
       <w:r>
         <w:t xml:space="preserve"> </w:t>
@@ -1433,16 +1406,54 @@
         <w:t xml:space="preserve">consume without re-downloading or reshaping protected data.</w:t>
       </w:r>
     </w:p>
-    <w:bookmarkStart w:id="20" w:name="_4ca054e7a719aceee114d5762f07fe88d525cd9"/>
-    <w:tbl>
-      <w:tblPr>
-        <w:tblStyle w:val="FigureTable"/>
-        <w:tblW w:type="auto" w:w="0"/>
-        <w:jc w:val="center"/>
-        <w:tblLook w:firstRow="0" w:lastRow="0" w:firstColumn="0" w:lastColumn="0"/>
-      </w:tblPr>
-      <w:tblGrid/>
-    </w:tbl>
+    <w:bookmarkStart w:id="23" w:name="_4ca054e7a719aceee114d5762f07fe88d525cd9"/>
+    <w:p>
+      <w:pPr>
+        <w:pStyle w:val="CaptionedFigure"/>
+      </w:pPr>
+      <w:r>
+        <w:drawing>
+          <wp:inline>
+            <wp:extent cx="5334000" cy="1198518"/>
+            <wp:effectExtent b="0" l="0" r="0" t="0"/>
+            <wp:docPr descr="" title="" id="21" name="Picture"/>
+            <a:graphic>
+              <a:graphicData uri="http://schemas.openxmlformats.org/drawingml/2006/picture">
+                <pic:pic>
+                  <pic:nvPicPr>
+                    <pic:cNvPr descr="tikz_fig1.png" id="22" name="Picture"/>
+                    <pic:cNvPicPr>
+                      <a:picLocks noChangeArrowheads="1" noChangeAspect="1"/>
+                    </pic:cNvPicPr>
+                  </pic:nvPicPr>
+                  <pic:blipFill>
+                    <a:blip r:embed="rId20"/>
+                    <a:stretch>
+                      <a:fillRect/>
+                    </a:stretch>
+                  </pic:blipFill>
+                  <pic:spPr bwMode="auto">
+                    <a:xfrm>
+                      <a:off x="0" y="0"/>
+                      <a:ext cx="5334000" cy="1198518"/>
+                    </a:xfrm>
+                    <a:prstGeom prst="rect">
+                      <a:avLst/>
+                    </a:prstGeom>
+                    <a:noFill/>
+                    <a:ln w="9525">
+                      <a:noFill/>
+                      <a:headEnd/>
+                      <a:tailEnd/>
+                    </a:ln>
+                  </pic:spPr>
+                </pic:pic>
+              </a:graphicData>
+            </a:graphic>
+          </wp:inline>
+        </w:drawing>
+      </w:r>
+    </w:p>
     <w:p>
       <w:pPr>
         <w:pStyle w:val="ImageCaption"/>
@@ -1463,16 +1474,16 @@
         <w:t xml:space="preserve">and protected-evaluation roles. FinBen–FOMC and FinTrust never enter the training pool.</w:t>
       </w:r>
     </w:p>
-    <w:bookmarkEnd w:id="20"/>
+    <w:bookmarkEnd w:id="23"/>
     <w:p>
       <w:pPr>
         <w:pStyle w:val="Heading2"/>
       </w:pPr>
-      <w:bookmarkStart w:id="21" w:name="_08fb122c5376457a548d9741bf4d2bc3704c84e"/>
+      <w:bookmarkStart w:id="24" w:name="_08fb122c5376457a548d9741bf4d2bc3704c84e"/>
       <w:r>
         <w:t xml:space="preserve">Data contract and gate procedure</w:t>
       </w:r>
-      <w:bookmarkEnd w:id="21"/>
+      <w:bookmarkEnd w:id="24"/>
     </w:p>
     <w:p>
       <w:pPr>
@@ -1524,16 +1535,54 @@
         <w:t xml:space="preserve">silently deleting legitimate financial-report reuse.</w:t>
       </w:r>
     </w:p>
-    <w:bookmarkStart w:id="22" w:name="_f8acff3f9589114731a29b0e02babf8b7c57ad9"/>
-    <w:tbl>
-      <w:tblPr>
-        <w:tblStyle w:val="FigureTable"/>
-        <w:tblW w:type="auto" w:w="0"/>
-        <w:jc w:val="center"/>
-        <w:tblLook w:firstRow="0" w:lastRow="0" w:firstColumn="0" w:lastColumn="0"/>
-      </w:tblPr>
-      <w:tblGrid/>
-    </w:tbl>
+    <w:bookmarkStart w:id="28" w:name="_f8acff3f9589114731a29b0e02babf8b7c57ad9"/>
+    <w:p>
+      <w:pPr>
+        <w:pStyle w:val="CaptionedFigure"/>
+      </w:pPr>
+      <w:r>
+        <w:drawing>
+          <wp:inline>
+            <wp:extent cx="5171406" cy="681977"/>
+            <wp:effectExtent b="0" l="0" r="0" t="0"/>
+            <wp:docPr descr="" title="" id="26" name="Picture"/>
+            <a:graphic>
+              <a:graphicData uri="http://schemas.openxmlformats.org/drawingml/2006/picture">
+                <pic:pic>
+                  <pic:nvPicPr>
+                    <pic:cNvPr descr="tikz_fig2.png" id="27" name="Picture"/>
+                    <pic:cNvPicPr>
+                      <a:picLocks noChangeArrowheads="1" noChangeAspect="1"/>
+                    </pic:cNvPicPr>
+                  </pic:nvPicPr>
+                  <pic:blipFill>
+                    <a:blip r:embed="rId25"/>
+                    <a:stretch>
+                      <a:fillRect/>
+                    </a:stretch>
+                  </pic:blipFill>
+                  <pic:spPr bwMode="auto">
+                    <a:xfrm>
+                      <a:off x="0" y="0"/>
+                      <a:ext cx="5171406" cy="681977"/>
+                    </a:xfrm>
+                    <a:prstGeom prst="rect">
+                      <a:avLst/>
+                    </a:prstGeom>
+                    <a:noFill/>
+                    <a:ln w="9525">
+                      <a:noFill/>
+                      <a:headEnd/>
+                      <a:tailEnd/>
+                    </a:ln>
+                  </pic:spPr>
+                </pic:pic>
+              </a:graphicData>
+            </a:graphic>
+          </wp:inline>
+        </w:drawing>
+      </w:r>
+    </w:p>
     <w:p>
       <w:pPr>
         <w:pStyle w:val="ImageCaption"/>
@@ -1548,7 +1597,7 @@
         <w:t xml:space="preserve">not override a PASS when no ERROR-severity gate fails.</w:t>
       </w:r>
     </w:p>
-    <w:bookmarkEnd w:id="22"/>
+    <w:bookmarkEnd w:id="28"/>
     <w:p>
       <w:pPr>
         <w:pStyle w:val="FirstParagraph"/>
@@ -1597,11 +1646,11 @@
       <w:pPr>
         <w:pStyle w:val="Heading2"/>
       </w:pPr>
-      <w:bookmarkStart w:id="23" w:name="_7e03c01745abd94f4d45757752faebae5f49d54"/>
+      <w:bookmarkStart w:id="29" w:name="_7e03c01745abd94f4d45757752faebae5f49d54"/>
       <w:r>
         <w:t xml:space="preserve">Phase-2.1 artifact and figure inventory</w:t>
       </w:r>
-      <w:bookmarkEnd w:id="23"/>
+      <w:bookmarkEnd w:id="29"/>
     </w:p>
     <w:p>
       <w:pPr>
@@ -1651,21 +1700,21 @@
       <w:pPr>
         <w:pStyle w:val="Heading1"/>
       </w:pPr>
-      <w:bookmarkStart w:id="24" w:name="_09ee8443ab55a3f30fdd88acf82bf7f547c29d1"/>
+      <w:bookmarkStart w:id="30" w:name="_09ee8443ab55a3f30fdd88acf82bf7f547c29d1"/>
       <w:r>
         <w:t xml:space="preserve">Method: EVG-CAS</w:t>
       </w:r>
-      <w:bookmarkEnd w:id="24"/>
+      <w:bookmarkEnd w:id="30"/>
     </w:p>
     <w:p>
       <w:pPr>
         <w:pStyle w:val="Heading2"/>
       </w:pPr>
-      <w:bookmarkStart w:id="25" w:name="_0b0a9a7e8f18d7d3892765ffabac4b36300ec7a"/>
+      <w:bookmarkStart w:id="31" w:name="_0b0a9a7e8f18d7d3892765ffabac4b36300ec7a"/>
       <w:r>
         <w:t xml:space="preserve">Sampling and execution verification</w:t>
       </w:r>
-      <w:bookmarkEnd w:id="25"/>
+      <w:bookmarkEnd w:id="31"/>
     </w:p>
     <w:p>
       <w:pPr>
@@ -1932,11 +1981,11 @@
       <w:pPr>
         <w:pStyle w:val="Heading2"/>
       </w:pPr>
-      <w:bookmarkStart w:id="26" w:name="_75d866d51f018345439af5f30ef4d6b3127e341"/>
+      <w:bookmarkStart w:id="32" w:name="_75d866d51f018345439af5f30ef4d6b3127e341"/>
       <w:r>
         <w:t xml:space="preserve">Trust features from the sample population</w:t>
       </w:r>
-      <w:bookmarkEnd w:id="26"/>
+      <w:bookmarkEnd w:id="32"/>
     </w:p>
     <w:p>
       <w:pPr>
@@ -2737,11 +2786,11 @@
       <w:pPr>
         <w:pStyle w:val="Heading2"/>
       </w:pPr>
-      <w:bookmarkStart w:id="27" w:name="_bea1baf3bad7332e831af37e2663abf71ebae81"/>
+      <w:bookmarkStart w:id="33" w:name="_bea1baf3bad7332e831af37e2663abf71ebae81"/>
       <w:r>
         <w:t xml:space="preserve">Calibration (C2)</w:t>
       </w:r>
-      <w:bookmarkEnd w:id="27"/>
+      <w:bookmarkEnd w:id="33"/>
     </w:p>
     <w:p>
       <w:pPr>
@@ -3177,11 +3226,11 @@
       <w:pPr>
         <w:pStyle w:val="Heading2"/>
       </w:pPr>
-      <w:bookmarkStart w:id="28" w:name="_6729bffa61f8299ba4d6dd9adaff96cad058fd0"/>
+      <w:bookmarkStart w:id="34" w:name="_6729bffa61f8299ba4d6dd9adaff96cad058fd0"/>
       <w:r>
         <w:t xml:space="preserve">Freeze and abstention rule (C2)</w:t>
       </w:r>
-      <w:bookmarkEnd w:id="28"/>
+      <w:bookmarkEnd w:id="34"/>
     </w:p>
     <w:p>
       <w:pPr>
@@ -4592,21 +4641,21 @@
       <w:pPr>
         <w:pStyle w:val="Heading1"/>
       </w:pPr>
-      <w:bookmarkStart w:id="29" w:name="_34a31f481a53c50d210a9b0529f8ef40f2f45bf"/>
+      <w:bookmarkStart w:id="35" w:name="_34a31f481a53c50d210a9b0529f8ef40f2f45bf"/>
       <w:r>
         <w:t xml:space="preserve">Experimental setup</w:t>
       </w:r>
-      <w:bookmarkEnd w:id="29"/>
-    </w:p>
-    <w:p>
-      <w:pPr>
-        <w:pStyle w:val="Heading4"/>
-      </w:pPr>
-      <w:bookmarkStart w:id="30" w:name="_23286af6a2a6d0706d1d6fe1c65de4c346b21e9"/>
+      <w:bookmarkEnd w:id="35"/>
+    </w:p>
+    <w:p>
+      <w:pPr>
+        <w:pStyle w:val="Heading2"/>
+      </w:pPr>
+      <w:bookmarkStart w:id="36" w:name="_23286af6a2a6d0706d1d6fe1c65de4c346b21e9"/>
       <w:r>
         <w:t xml:space="preserve">Data and aligned evaluation.</w:t>
       </w:r>
-      <w:bookmarkEnd w:id="30"/>
+      <w:bookmarkEnd w:id="36"/>
     </w:p>
     <w:p>
       <w:pPr>
@@ -4760,13 +4809,13 @@
     </w:p>
     <w:p>
       <w:pPr>
-        <w:pStyle w:val="Heading4"/>
-      </w:pPr>
-      <w:bookmarkStart w:id="31" w:name="_2a068b96cf37f2e3e7955f9181c06dcf02620ab"/>
+        <w:pStyle w:val="Heading2"/>
+      </w:pPr>
+      <w:bookmarkStart w:id="37" w:name="_2a068b96cf37f2e3e7955f9181c06dcf02620ab"/>
       <w:r>
         <w:t xml:space="preserve">Data contract and split policy.</w:t>
       </w:r>
-      <w:bookmarkEnd w:id="31"/>
+      <w:bookmarkEnd w:id="37"/>
     </w:p>
     <w:p>
       <w:pPr>
@@ -4826,13 +4875,13 @@
     </w:p>
     <w:p>
       <w:pPr>
-        <w:pStyle w:val="Heading4"/>
-      </w:pPr>
-      <w:bookmarkStart w:id="32" w:name="_15c31db93c28bc7b48cf9bb8d3452dc310bd616"/>
+        <w:pStyle w:val="Heading2"/>
+      </w:pPr>
+      <w:bookmarkStart w:id="38" w:name="_15c31db93c28bc7b48cf9bb8d3452dc310bd616"/>
       <w:r>
         <w:t xml:space="preserve">Model.</w:t>
       </w:r>
-      <w:bookmarkEnd w:id="32"/>
+      <w:bookmarkEnd w:id="38"/>
     </w:p>
     <w:p>
       <w:pPr>
@@ -4892,13 +4941,13 @@
     </w:p>
     <w:p>
       <w:pPr>
-        <w:pStyle w:val="Heading4"/>
-      </w:pPr>
-      <w:bookmarkStart w:id="33" w:name="_c4db3759797ece13e7b7782031ec340dea27193"/>
+        <w:pStyle w:val="Heading2"/>
+      </w:pPr>
+      <w:bookmarkStart w:id="39" w:name="_c4db3759797ece13e7b7782031ec340dea27193"/>
       <w:r>
         <w:t xml:space="preserve">Metrics.</w:t>
       </w:r>
-      <w:bookmarkEnd w:id="33"/>
+      <w:bookmarkEnd w:id="39"/>
     </w:p>
     <w:p>
       <w:pPr>
@@ -4962,7 +5011,7 @@
         <w:t xml:space="preserve">).</w:t>
       </w:r>
     </w:p>
-    <w:bookmarkStart w:id="34" w:name="_97a02e71e75ed989c4fd06271d7d4643470371a"/>
+    <w:bookmarkStart w:id="40" w:name="_97a02e71e75ed989c4fd06271d7d4643470371a"/>
     <w:p>
       <w:pPr>
         <w:pStyle w:val="TableCaption"/>
@@ -5231,8 +5280,8 @@
         </w:tc>
       </w:tr>
     </w:tbl>
-    <w:bookmarkEnd w:id="34"/>
-    <w:bookmarkStart w:id="38" w:name="_b926df73e6b46886e316a4f3d68c61db450565d"/>
+    <w:bookmarkEnd w:id="40"/>
+    <w:bookmarkStart w:id="44" w:name="_b926df73e6b46886e316a4f3d68c61db450565d"/>
     <w:p>
       <w:pPr>
         <w:pStyle w:val="CaptionedFigure"/>
@@ -5242,18 +5291,18 @@
           <wp:inline>
             <wp:extent cx="5334000" cy="2703454"/>
             <wp:effectExtent b="0" l="0" r="0" t="0"/>
-            <wp:docPr descr="" title="" id="36" name="Picture"/>
+            <wp:docPr descr="" title="" id="42" name="Picture"/>
             <a:graphic>
               <a:graphicData uri="http://schemas.openxmlformats.org/drawingml/2006/picture">
                 <pic:pic>
                   <pic:nvPicPr>
-                    <pic:cNvPr descr="fig_phase4_fiqa_aggregation.png" id="37" name="Picture"/>
+                    <pic:cNvPr descr="fig_phase4_fiqa_aggregation.png" id="43" name="Picture"/>
                     <pic:cNvPicPr>
                       <a:picLocks noChangeArrowheads="1" noChangeAspect="1"/>
                     </pic:cNvPicPr>
                   </pic:nvPicPr>
                   <pic:blipFill>
-                    <a:blip r:embed="rId35"/>
+                    <a:blip r:embed="rId41"/>
                     <a:stretch>
                       <a:fillRect/>
                     </a:stretch>
@@ -5300,8 +5349,8 @@
         <w:t xml:space="preserve">while the frozen protected-test policy remains the pre-registered greedy baseline.</w:t>
       </w:r>
     </w:p>
-    <w:bookmarkEnd w:id="38"/>
-    <w:bookmarkStart w:id="39" w:name="_73cca14bfab0538c23cf8bdcd6020bf0c4aecdc"/>
+    <w:bookmarkEnd w:id="44"/>
+    <w:bookmarkStart w:id="45" w:name="_73cca14bfab0538c23cf8bdcd6020bf0c4aecdc"/>
     <w:p>
       <w:pPr>
         <w:pStyle w:val="TableCaption"/>
@@ -5544,8 +5593,8 @@
         </w:tc>
       </w:tr>
     </w:tbl>
-    <w:bookmarkEnd w:id="39"/>
-    <w:bookmarkStart w:id="43" w:name="_7e499be34202aeecfec2782f7d8f9bd40d806c2"/>
+    <w:bookmarkEnd w:id="45"/>
+    <w:bookmarkStart w:id="49" w:name="_7e499be34202aeecfec2782f7d8f9bd40d806c2"/>
     <w:p>
       <w:pPr>
         <w:pStyle w:val="CaptionedFigure"/>
@@ -5555,18 +5604,18 @@
           <wp:inline>
             <wp:extent cx="5334000" cy="2828015"/>
             <wp:effectExtent b="0" l="0" r="0" t="0"/>
-            <wp:docPr descr="" title="" id="41" name="Picture"/>
+            <wp:docPr descr="" title="" id="47" name="Picture"/>
             <a:graphic>
               <a:graphicData uri="http://schemas.openxmlformats.org/drawingml/2006/picture">
                 <pic:pic>
                   <pic:nvPicPr>
-                    <pic:cNvPr descr="fig_phase4_risk_coverage.png" id="42" name="Picture"/>
+                    <pic:cNvPr descr="fig_phase4_risk_coverage.png" id="48" name="Picture"/>
                     <pic:cNvPicPr>
                       <a:picLocks noChangeArrowheads="1" noChangeAspect="1"/>
                     </pic:cNvPicPr>
                   </pic:nvPicPr>
                   <pic:blipFill>
-                    <a:blip r:embed="rId40"/>
+                    <a:blip r:embed="rId46"/>
                     <a:stretch>
                       <a:fillRect/>
                     </a:stretch>
@@ -5613,8 +5662,8 @@
         <w:t xml:space="preserve">weaker separation, consistent with its small regression validation split.</w:t>
       </w:r>
     </w:p>
-    <w:bookmarkEnd w:id="43"/>
-    <w:bookmarkStart w:id="47" w:name="_404756ca65f0752ce4eb46cd868618de9b97358"/>
+    <w:bookmarkEnd w:id="49"/>
+    <w:bookmarkStart w:id="53" w:name="_404756ca65f0752ce4eb46cd868618de9b97358"/>
     <w:p>
       <w:pPr>
         <w:pStyle w:val="CaptionedFigure"/>
@@ -5624,18 +5673,18 @@
           <wp:inline>
             <wp:extent cx="4498603" cy="3049019"/>
             <wp:effectExtent b="0" l="0" r="0" t="0"/>
-            <wp:docPr descr="" title="" id="45" name="Picture"/>
+            <wp:docPr descr="" title="" id="51" name="Picture"/>
             <a:graphic>
               <a:graphicData uri="http://schemas.openxmlformats.org/drawingml/2006/picture">
                 <pic:pic>
                   <pic:nvPicPr>
-                    <pic:cNvPr descr="fig_phase4_selection_ablation.png" id="46" name="Picture"/>
+                    <pic:cNvPr descr="fig_phase4_selection_ablation.png" id="52" name="Picture"/>
                     <pic:cNvPicPr>
                       <a:picLocks noChangeArrowheads="1" noChangeAspect="1"/>
                     </pic:cNvPicPr>
                   </pic:nvPicPr>
                   <pic:blipFill>
-                    <a:blip r:embed="rId44"/>
+                    <a:blip r:embed="rId50"/>
                     <a:stretch>
                       <a:fillRect/>
                     </a:stretch>
@@ -5688,8 +5737,8 @@
         <w:t xml:space="preserve">signal rather than as an accuracy claim.</w:t>
       </w:r>
     </w:p>
-    <w:bookmarkEnd w:id="47"/>
-    <w:bookmarkStart w:id="48" w:name="_d0acb02147d05e0424d60de084afbad0eacdde0"/>
+    <w:bookmarkEnd w:id="53"/>
+    <w:bookmarkStart w:id="54" w:name="_d0acb02147d05e0424d60de084afbad0eacdde0"/>
     <w:p>
       <w:pPr>
         <w:pStyle w:val="TableCaption"/>
@@ -6010,58 +6059,33 @@
         </w:tc>
       </w:tr>
     </w:tbl>
-    <w:bookmarkEnd w:id="48"/>
+    <w:bookmarkEnd w:id="54"/>
     <w:p>
       <w:pPr>
         <w:pStyle w:val="Heading1"/>
       </w:pPr>
-      <w:bookmarkStart w:id="49" w:name="_a28f169358a053f7b171a621bd02ee9ea3d1d28"/>
+      <w:bookmarkStart w:id="55" w:name="_a28f169358a053f7b171a621bd02ee9ea3d1d28"/>
       <w:r>
         <w:t xml:space="preserve">Results</w:t>
       </w:r>
-      <w:bookmarkEnd w:id="49"/>
-    </w:p>
-    <w:p>
-      <w:pPr>
-        <w:pStyle w:val="Heading4"/>
-      </w:pPr>
-      <w:bookmarkStart w:id="50" w:name="_79156a38e22d161d80521c948cfbf2e18b1456e"/>
+      <w:bookmarkEnd w:id="55"/>
+    </w:p>
+    <w:p>
+      <w:pPr>
+        <w:pStyle w:val="Heading2"/>
+      </w:pPr>
+      <w:bookmarkStart w:id="56" w:name="_79156a38e22d161d80521c948cfbf2e18b1456e"/>
       <w:r>
         <w:t xml:space="preserve">C1 is rejected — and that is a result.</w:t>
       </w:r>
-      <w:bookmarkEnd w:id="50"/>
+      <w:bookmarkEnd w:id="56"/>
     </w:p>
     <w:p>
       <w:pPr>
         <w:pStyle w:val="FirstParagraph"/>
       </w:pPr>
       <w:r>
-        <w:t xml:space="preserve">Table </w:t>
-      </w:r>
-      <w:hyperlink w:anchor="_97a02e71e75ed989c4fd06271d7d4643470371a">
-        <w:r>
-          <w:rPr>
-            <w:rStyle w:val="Hyperlink"/>
-          </w:rPr>
-          <w:t xml:space="preserve">1</w:t>
-        </w:r>
-      </w:hyperlink>
-      <w:r>
-        <w:t xml:space="preserve"> </w:t>
-      </w:r>
-      <w:r>
-        <w:t xml:space="preserve">and Figure </w:t>
-      </w:r>
-      <w:hyperlink w:anchor="_b926df73e6b46886e316a4f3d68c61db450565d">
-        <w:r>
-          <w:rPr>
-            <w:rStyle w:val="Hyperlink"/>
-          </w:rPr>
-          <w:t xml:space="preserve">3</w:t>
-        </w:r>
-      </w:hyperlink>
-      <w:r>
-        <w:t xml:space="preserve">. On the protected test, execution-verified selection is 0.6556 vs. frozen greedy 0.6574 (</w:t>
+        <w:t xml:space="preserve">Table IV and Figure 3. On the protected test, execution-verified selection is 0.6556 vs. frozen greedy 0.6574 (</w:t>
       </w:r>
       <m:oMath>
         <m:r>
@@ -6275,31 +6299,20 @@
     </w:p>
     <w:p>
       <w:pPr>
-        <w:pStyle w:val="Heading4"/>
-      </w:pPr>
-      <w:bookmarkStart w:id="51" w:name="_23248e215c6ab81529636492734ea76e55d252c"/>
+        <w:pStyle w:val="Heading2"/>
+      </w:pPr>
+      <w:bookmarkStart w:id="57" w:name="_23248e215c6ab81529636492734ea76e55d252c"/>
       <w:r>
         <w:t xml:space="preserve">Agreement is the trust signal (C3 evidence at the decision level).</w:t>
       </w:r>
-      <w:bookmarkEnd w:id="51"/>
+      <w:bookmarkEnd w:id="57"/>
     </w:p>
     <w:p>
       <w:pPr>
         <w:pStyle w:val="FirstParagraph"/>
       </w:pPr>
       <w:r>
-        <w:t xml:space="preserve">Table </w:t>
-      </w:r>
-      <w:hyperlink w:anchor="_73cca14bfab0538c23cf8bdcd6020bf0c4aecdc">
-        <w:r>
-          <w:rPr>
-            <w:rStyle w:val="Hyperlink"/>
-          </w:rPr>
-          <w:t xml:space="preserve">2</w:t>
-        </w:r>
-      </w:hyperlink>
-      <w:r>
-        <w:t xml:space="preserve">. On protected data the model reports total</w:t>
+        <w:t xml:space="preserve">Table V. On protected data the model reports total</w:t>
       </w:r>
       <w:r>
         <w:t xml:space="preserve"> </w:t>
@@ -6374,31 +6387,20 @@
     </w:p>
     <w:p>
       <w:pPr>
-        <w:pStyle w:val="Heading4"/>
-      </w:pPr>
-      <w:bookmarkStart w:id="52" w:name="_c82d4da9cfe82af92735de5280c4deea13b0ed0"/>
+        <w:pStyle w:val="Heading2"/>
+      </w:pPr>
+      <w:bookmarkStart w:id="58" w:name="_c82d4da9cfe82af92735de5280c4deea13b0ed0"/>
       <w:r>
         <w:t xml:space="preserve">Calibration gives the threshold meaning (C2).</w:t>
       </w:r>
-      <w:bookmarkEnd w:id="52"/>
+      <w:bookmarkEnd w:id="58"/>
     </w:p>
     <w:p>
       <w:pPr>
         <w:pStyle w:val="FirstParagraph"/>
       </w:pPr>
       <w:r>
-        <w:t xml:space="preserve">Table </w:t>
-      </w:r>
-      <w:hyperlink w:anchor="_bd29bad6bdabc22928f9753cfc639245b8d1ad9">
-        <w:r>
-          <w:rPr>
-            <w:rStyle w:val="Hyperlink"/>
-          </w:rPr>
-          <w:t xml:space="preserve">[tab:calib]</w:t>
-        </w:r>
-      </w:hyperlink>
-      <w:r>
-        <w:t xml:space="preserve">. Out-of-fold Platt on the agreement features cuts Brier 0.28</w:t>
+        <w:t xml:space="preserve">Table VI. Out-of-fold Platt on the agreement features cuts Brier 0.28</w:t>
       </w:r>
       <w:r>
         <w:t xml:space="preserve"> </w:t>
@@ -6497,45 +6499,20 @@
     </w:p>
     <w:p>
       <w:pPr>
-        <w:pStyle w:val="Heading4"/>
-      </w:pPr>
-      <w:bookmarkStart w:id="53" w:name="_896d75589fe437b5ce1a87349f36bd9e71f4ab8"/>
+        <w:pStyle w:val="Heading2"/>
+      </w:pPr>
+      <w:bookmarkStart w:id="59" w:name="_896d75589fe437b5ce1a87349f36bd9e71f4ab8"/>
       <w:r>
         <w:t xml:space="preserve">The frozen policy transfers (C2’s operational payoff).</w:t>
       </w:r>
-      <w:bookmarkEnd w:id="53"/>
+      <w:bookmarkEnd w:id="59"/>
     </w:p>
     <w:p>
       <w:pPr>
         <w:pStyle w:val="FirstParagraph"/>
       </w:pPr>
       <w:r>
-        <w:t xml:space="preserve">Table </w:t>
-      </w:r>
-      <w:hyperlink w:anchor="_16a848194123a7387559aaf877a1bbf043d1f4c">
-        <w:r>
-          <w:rPr>
-            <w:rStyle w:val="Hyperlink"/>
-          </w:rPr>
-          <w:t xml:space="preserve">[tab:transfer]</w:t>
-        </w:r>
-      </w:hyperlink>
-      <w:r>
-        <w:t xml:space="preserve"> </w:t>
-      </w:r>
-      <w:r>
-        <w:t xml:space="preserve">and Figure </w:t>
-      </w:r>
-      <w:hyperlink w:anchor="_7e499be34202aeecfec2782f7d8f9bd40d806c2">
-        <w:r>
-          <w:rPr>
-            <w:rStyle w:val="Hyperlink"/>
-          </w:rPr>
-          <w:t xml:space="preserve">4</w:t>
-        </w:r>
-      </w:hyperlink>
-      <w:r>
-        <w:t xml:space="preserve">. With the threshold fixed on validation, opening the protected test</w:t>
+        <w:t xml:space="preserve">Table VII and Figure 4. With the threshold fixed on validation, opening the protected test</w:t>
       </w:r>
       <w:r>
         <w:t xml:space="preserve"> </w:t>
@@ -6627,24 +6604,13 @@
     </w:p>
     <w:p>
       <w:pPr>
-        <w:pStyle w:val="Heading4"/>
-      </w:pPr>
-      <w:bookmarkStart w:id="54" w:name="_47f25f52c5b5f464565a74b77a708738c0823ad"/>
-      <w:r>
-        <w:t xml:space="preserve">Rigor, error taxonomy, and depth (Table </w:t>
-      </w:r>
-      <w:hyperlink w:anchor="_d0acb02147d05e0424d60de084afbad0eacdde0">
-        <w:r>
-          <w:rPr>
-            <w:rStyle w:val="Hyperlink"/>
-          </w:rPr>
-          <w:t xml:space="preserve">3</w:t>
-        </w:r>
-      </w:hyperlink>
-      <w:r>
-        <w:t xml:space="preserve">).</w:t>
-      </w:r>
-      <w:bookmarkEnd w:id="54"/>
+        <w:pStyle w:val="Heading2"/>
+      </w:pPr>
+      <w:bookmarkStart w:id="60" w:name="_8874b44d3c6c62724dcf79b432fefba8c3e8f04"/>
+      <w:r>
+        <w:t xml:space="preserve">Rigor, error taxonomy, and depth (Table VIII).</w:t>
+      </w:r>
+      <w:bookmarkEnd w:id="60"/>
     </w:p>
     <w:p>
       <w:pPr>
@@ -6802,45 +6768,20 @@
     </w:p>
     <w:p>
       <w:pPr>
-        <w:pStyle w:val="Heading4"/>
-      </w:pPr>
-      <w:bookmarkStart w:id="55" w:name="_a7dfb997285f6fe1e38920d18af17ea0a175be0"/>
-      <w:r>
-        <w:t xml:space="preserve">The mechanism survives comparison at matched coverage (Table </w:t>
-      </w:r>
-      <w:hyperlink w:anchor="_51eaa84ff8727f07d489da1a5724410a97e80f7">
-        <w:r>
-          <w:rPr>
-            <w:rStyle w:val="Hyperlink"/>
-          </w:rPr>
-          <w:t xml:space="preserve">[tab:ablate]</w:t>
-        </w:r>
-      </w:hyperlink>
-      <w:r>
-        <w:t xml:space="preserve">).</w:t>
-      </w:r>
-      <w:bookmarkEnd w:id="55"/>
+        <w:pStyle w:val="Heading2"/>
+      </w:pPr>
+      <w:bookmarkStart w:id="61" w:name="_6b3bb25d38c8284276cb47da23a1a3a28b2fca9"/>
+      <w:r>
+        <w:t xml:space="preserve">The mechanism survives comparison at matched coverage (Table X).</w:t>
+      </w:r>
+      <w:bookmarkEnd w:id="61"/>
     </w:p>
     <w:p>
       <w:pPr>
         <w:pStyle w:val="FirstParagraph"/>
       </w:pPr>
       <w:r>
-        <w:t xml:space="preserve">Figure </w:t>
-      </w:r>
-      <w:hyperlink w:anchor="_404756ca65f0752ce4eb46cd868618de9b97358">
-        <w:r>
-          <w:rPr>
-            <w:rStyle w:val="Hyperlink"/>
-          </w:rPr>
-          <w:t xml:space="preserve">5</w:t>
-        </w:r>
-      </w:hyperlink>
-      <w:r>
-        <w:t xml:space="preserve"> </w:t>
-      </w:r>
-      <w:r>
-        <w:t xml:space="preserve">shows the corresponding validation ablation. Review pressure asks how agreement-abstention compares with standard alternatives when</w:t>
+        <w:t xml:space="preserve">Figure 5 shows the corresponding validation ablation. Review pressure asks how agreement-abstention compares with standard alternatives when</w:t>
       </w:r>
       <w:r>
         <w:t xml:space="preserve"> </w:t>
@@ -6859,21 +6800,7 @@
         <w:t xml:space="preserve">same number of questions</w:t>
       </w:r>
       <w:r>
-        <w:t xml:space="preserve">. Table </w:t>
-      </w:r>
-      <w:hyperlink w:anchor="_51eaa84ff8727f07d489da1a5724410a97e80f7">
-        <w:r>
-          <w:rPr>
-            <w:rStyle w:val="Hyperlink"/>
-          </w:rPr>
-          <w:t xml:space="preserve">[tab:ablate]</w:t>
-        </w:r>
-      </w:hyperlink>
-      <w:r>
-        <w:t xml:space="preserve"> </w:t>
-      </w:r>
-      <w:r>
-        <w:t xml:space="preserve">selects</w:t>
+        <w:t xml:space="preserve">. Table X selects</w:t>
       </w:r>
       <w:r>
         <w:t xml:space="preserve"> </w:t>
@@ -7109,31 +7036,20 @@
     </w:p>
     <w:p>
       <w:pPr>
-        <w:pStyle w:val="Heading4"/>
-      </w:pPr>
-      <w:bookmarkStart w:id="56" w:name="_3343413875ce0e0a030677e0cfce99b66a2b6b9"/>
+        <w:pStyle w:val="Heading2"/>
+      </w:pPr>
+      <w:bookmarkStart w:id="62" w:name="_3343413875ce0e0a030677e0cfce99b66a2b6b9"/>
       <w:r>
         <w:t xml:space="preserve">Out-of-domain robustness.</w:t>
       </w:r>
-      <w:bookmarkEnd w:id="56"/>
+      <w:bookmarkEnd w:id="62"/>
     </w:p>
     <w:p>
       <w:pPr>
         <w:pStyle w:val="FirstParagraph"/>
       </w:pPr>
       <w:r>
-        <w:t xml:space="preserve">Table </w:t>
-      </w:r>
-      <w:hyperlink w:anchor="_717991e67bcd61bd371563762f496f2f608d7c5">
-        <w:r>
-          <w:rPr>
-            <w:rStyle w:val="Hyperlink"/>
-          </w:rPr>
-          <w:t xml:space="preserve">[tab:fomc]</w:t>
-        </w:r>
-      </w:hyperlink>
-      <w:r>
-        <w:t xml:space="preserve">. Without any FOMC data in training, the frozen adapter raises macro-F1</w:t>
+        <w:t xml:space="preserve">Table IX. Without any FOMC data in training, the frozen adapter raises macro-F1</w:t>
       </w:r>
       <w:r>
         <w:t xml:space="preserve"> </w:t>
@@ -7218,13 +7134,13 @@
     </w:p>
     <w:p>
       <w:pPr>
-        <w:pStyle w:val="Heading4"/>
-      </w:pPr>
-      <w:bookmarkStart w:id="57" w:name="_7311d421c51b2bf9042c8e2a1cd2608f1da5d70"/>
+        <w:pStyle w:val="Heading2"/>
+      </w:pPr>
+      <w:bookmarkStart w:id="63" w:name="_7311d421c51b2bf9042c8e2a1cd2608f1da5d70"/>
       <w:r>
         <w:t xml:space="preserve">Cost.</w:t>
       </w:r>
-      <w:bookmarkEnd w:id="57"/>
+      <w:bookmarkEnd w:id="63"/>
     </w:p>
     <w:p>
       <w:pPr>
@@ -7334,11 +7250,11 @@
       <w:pPr>
         <w:pStyle w:val="Heading1"/>
       </w:pPr>
-      <w:bookmarkStart w:id="58" w:name="_995727483262ea8ba7892e2ddf49eb09a6add3d"/>
+      <w:bookmarkStart w:id="64" w:name="_995727483262ea8ba7892e2ddf49eb09a6add3d"/>
       <w:r>
         <w:t xml:space="preserve">Additional Validation Diagnostics</w:t>
       </w:r>
-      <w:bookmarkEnd w:id="58"/>
+      <w:bookmarkEnd w:id="64"/>
     </w:p>
     <w:p>
       <w:pPr>
@@ -7370,11 +7286,11 @@
       <w:pPr>
         <w:pStyle w:val="Heading2"/>
       </w:pPr>
-      <w:bookmarkStart w:id="59" w:name="_4da3e3005a056c4fc059679a648235c0c11c8f6"/>
+      <w:bookmarkStart w:id="65" w:name="_4da3e3005a056c4fc059679a648235c0c11c8f6"/>
       <w:r>
         <w:t xml:space="preserve">Failure channels</w:t>
       </w:r>
-      <w:bookmarkEnd w:id="59"/>
+      <w:bookmarkEnd w:id="65"/>
     </w:p>
     <w:p>
       <w:pPr>
@@ -7440,16 +7356,8 @@
         <w:t xml:space="preserve"> </w:t>
       </w:r>
       <w:r>
-        <w:t xml:space="preserve">the execution and printed channels independently. Figure </w:t>
-      </w:r>
-      <w:hyperlink w:anchor="_6f3f2161dc19e8bca02f421b20baa275e393018">
-        <w:r>
-          <w:rPr>
-            <w:rStyle w:val="Hyperlink"/>
-          </w:rPr>
-          <w:t xml:space="preserve">6</w:t>
-        </w:r>
-      </w:hyperlink>
+        <w:t xml:space="preserve">the execution and printed channels independently. Figure 6</w:t>
+      </w:r>
       <w:r>
         <w:t xml:space="preserve"> </w:t>
       </w:r>
@@ -7460,21 +7368,10 @@
         <w:t xml:space="preserve"> </w:t>
       </w:r>
       <w:r>
-        <w:t xml:space="preserve">not a replacement for the protected-test taxonomy in Table </w:t>
-      </w:r>
-      <w:hyperlink w:anchor="_d0acb02147d05e0424d60de084afbad0eacdde0">
-        <w:r>
-          <w:rPr>
-            <w:rStyle w:val="Hyperlink"/>
-          </w:rPr>
-          <w:t xml:space="preserve">3</w:t>
-        </w:r>
-      </w:hyperlink>
-      <w:r>
-        <w:t xml:space="preserve">.</w:t>
-      </w:r>
-    </w:p>
-    <w:bookmarkStart w:id="63" w:name="_6f3f2161dc19e8bca02f421b20baa275e393018"/>
+        <w:t xml:space="preserve">not a replacement for the protected-test taxonomy in Table VIII.</w:t>
+      </w:r>
+    </w:p>
+    <w:bookmarkStart w:id="69" w:name="_6f3f2161dc19e8bca02f421b20baa275e393018"/>
     <w:p>
       <w:pPr>
         <w:pStyle w:val="CaptionedFigure"/>
@@ -7484,18 +7381,18 @@
           <wp:inline>
             <wp:extent cx="5334000" cy="4134224"/>
             <wp:effectExtent b="0" l="0" r="0" t="0"/>
-            <wp:docPr descr="" title="" id="61" name="Picture"/>
+            <wp:docPr descr="" title="" id="67" name="Picture"/>
             <a:graphic>
               <a:graphicData uri="http://schemas.openxmlformats.org/drawingml/2006/picture">
                 <pic:pic>
                   <pic:nvPicPr>
-                    <pic:cNvPr descr="fig6_finqa_failure_overview.png" id="62" name="Picture"/>
+                    <pic:cNvPr descr="fig6_finqa_failure_overview.png" id="68" name="Picture"/>
                     <pic:cNvPicPr>
                       <a:picLocks noChangeArrowheads="1" noChangeAspect="1"/>
                     </pic:cNvPicPr>
                   </pic:nvPicPr>
                   <pic:blipFill>
-                    <a:blip r:embed="rId60"/>
+                    <a:blip r:embed="rId66"/>
                     <a:stretch>
                       <a:fillRect/>
                     </a:stretch>
@@ -7536,16 +7433,16 @@
         <w:t xml:space="preserve">Execution, program, and printed-answer channels are kept distinct.</w:t>
       </w:r>
     </w:p>
-    <w:bookmarkEnd w:id="63"/>
+    <w:bookmarkEnd w:id="69"/>
     <w:p>
       <w:pPr>
         <w:pStyle w:val="Heading2"/>
       </w:pPr>
-      <w:bookmarkStart w:id="64" w:name="_6caf6b27ae2663c2f6ac350c6638f04485305b6"/>
+      <w:bookmarkStart w:id="70" w:name="_6caf6b27ae2663c2f6ac350c6638f04485305b6"/>
       <w:r>
         <w:t xml:space="preserve">Confidence and error magnitude</w:t>
       </w:r>
-      <w:bookmarkEnd w:id="64"/>
+      <w:bookmarkEnd w:id="70"/>
     </w:p>
     <w:p>
       <w:pPr>
@@ -7570,21 +7467,7 @@
         <w:t xml:space="preserve"> </w:t>
       </w:r>
       <w:r>
-        <w:t xml:space="preserve">incorrect numerical responses. Figure </w:t>
-      </w:r>
-      <w:hyperlink w:anchor="_a21bbbd5f8ee47259add24f849d1c8dd2a7cb4b">
-        <w:r>
-          <w:rPr>
-            <w:rStyle w:val="Hyperlink"/>
-          </w:rPr>
-          <w:t xml:space="preserve">7</w:t>
-        </w:r>
-      </w:hyperlink>
-      <w:r>
-        <w:t xml:space="preserve"> </w:t>
-      </w:r>
-      <w:r>
-        <w:t xml:space="preserve">visualizes the</w:t>
+        <w:t xml:space="preserve">incorrect numerical responses. Figure 7 visualizes the</w:t>
       </w:r>
       <w:r>
         <w:t xml:space="preserve"> </w:t>
@@ -7611,7 +7494,7 @@
         <w:t xml:space="preserve">probability.</w:t>
       </w:r>
     </w:p>
-    <w:bookmarkStart w:id="68" w:name="_a21bbbd5f8ee47259add24f849d1c8dd2a7cb4b"/>
+    <w:bookmarkStart w:id="74" w:name="_a21bbbd5f8ee47259add24f849d1c8dd2a7cb4b"/>
     <w:p>
       <w:pPr>
         <w:pStyle w:val="CaptionedFigure"/>
@@ -7621,18 +7504,18 @@
           <wp:inline>
             <wp:extent cx="4862528" cy="3516923"/>
             <wp:effectExtent b="0" l="0" r="0" t="0"/>
-            <wp:docPr descr="" title="" id="66" name="Picture"/>
+            <wp:docPr descr="" title="" id="72" name="Picture"/>
             <a:graphic>
               <a:graphicData uri="http://schemas.openxmlformats.org/drawingml/2006/picture">
                 <pic:pic>
                   <pic:nvPicPr>
-                    <pic:cNvPr descr="fig3_finqa_confidence_by_failure.png" id="67" name="Picture"/>
+                    <pic:cNvPr descr="fig3_finqa_confidence_by_failure.png" id="73" name="Picture"/>
                     <pic:cNvPicPr>
                       <a:picLocks noChangeArrowheads="1" noChangeAspect="1"/>
                     </pic:cNvPicPr>
                   </pic:nvPicPr>
                   <pic:blipFill>
-                    <a:blip r:embed="rId65"/>
+                    <a:blip r:embed="rId71"/>
                     <a:stretch>
                       <a:fillRect/>
                     </a:stretch>
@@ -7679,7 +7562,7 @@
         <w:t xml:space="preserve">not used as a calibrated probability without validation-only calibration.</w:t>
       </w:r>
     </w:p>
-    <w:bookmarkEnd w:id="68"/>
+    <w:bookmarkEnd w:id="74"/>
     <w:p>
       <w:pPr>
         <w:pStyle w:val="FirstParagraph"/>
@@ -7720,16 +7603,8 @@
         <w:t xml:space="preserve"> </w:t>
       </w:r>
       <w:r>
-        <w:t xml:space="preserve">errors concentrate at the positive or negative ends of the sentiment scale. Figure </w:t>
-      </w:r>
-      <w:hyperlink w:anchor="_b15dd2eb2fdd1a0ff87742a64a53f970d3f3294">
-        <w:r>
-          <w:rPr>
-            <w:rStyle w:val="Hyperlink"/>
-          </w:rPr>
-          <w:t xml:space="preserve">8</w:t>
-        </w:r>
-      </w:hyperlink>
+        <w:t xml:space="preserve">errors concentrate at the positive or negative ends of the sentiment scale. Figure 8</w:t>
+      </w:r>
       <w:r>
         <w:t xml:space="preserve"> </w:t>
       </w:r>
@@ -7766,7 +7641,7 @@
         <w:t xml:space="preserve">population-level estimates.</w:t>
       </w:r>
     </w:p>
-    <w:bookmarkStart w:id="72" w:name="_b15dd2eb2fdd1a0ff87742a64a53f970d3f3294"/>
+    <w:bookmarkStart w:id="78" w:name="_b15dd2eb2fdd1a0ff87742a64a53f970d3f3294"/>
     <w:p>
       <w:pPr>
         <w:pStyle w:val="CaptionedFigure"/>
@@ -7776,18 +7651,18 @@
           <wp:inline>
             <wp:extent cx="5334000" cy="3058678"/>
             <wp:effectExtent b="0" l="0" r="0" t="0"/>
-            <wp:docPr descr="" title="" id="70" name="Picture"/>
+            <wp:docPr descr="" title="" id="76" name="Picture"/>
             <a:graphic>
               <a:graphicData uri="http://schemas.openxmlformats.org/drawingml/2006/picture">
                 <pic:pic>
                   <pic:nvPicPr>
-                    <pic:cNvPr descr="fig5_finqa_error_magnitude.png" id="71" name="Picture"/>
+                    <pic:cNvPr descr="fig5_finqa_error_magnitude.png" id="77" name="Picture"/>
                     <pic:cNvPicPr>
                       <a:picLocks noChangeArrowheads="1" noChangeAspect="1"/>
                     </pic:cNvPicPr>
                   </pic:nvPicPr>
                   <pic:blipFill>
-                    <a:blip r:embed="rId69"/>
+                    <a:blip r:embed="rId75"/>
                     <a:stretch>
                       <a:fillRect/>
                     </a:stretch>
@@ -7822,16 +7697,16 @@
         <w:t xml:space="preserve">E5 validation absolute-error distribution for FiQA sentiment regression.</w:t>
       </w:r>
     </w:p>
-    <w:bookmarkEnd w:id="72"/>
+    <w:bookmarkEnd w:id="78"/>
     <w:p>
       <w:pPr>
         <w:pStyle w:val="Heading2"/>
       </w:pPr>
-      <w:bookmarkStart w:id="73" w:name="_8204df28d0260ca4fcc85605c43557011df87d6"/>
+      <w:bookmarkStart w:id="79" w:name="_8204df28d0260ca4fcc85605c43557011df87d6"/>
       <w:r>
         <w:t xml:space="preserve">Reproducibility and resource accounting</w:t>
       </w:r>
-      <w:bookmarkEnd w:id="73"/>
+      <w:bookmarkEnd w:id="79"/>
     </w:p>
     <w:p>
       <w:pPr>
@@ -7999,16 +7874,68 @@
       <w:pPr>
         <w:pStyle w:val="Heading1"/>
       </w:pPr>
-      <w:bookmarkStart w:id="74" w:name="_cbd875682116f3153fa9a8f9c77c00f8b5fdab1"/>
+      <w:bookmarkStart w:id="80" w:name="_cbd875682116f3153fa9a8f9c77c00f8b5fdab1"/>
       <w:r>
         <w:t xml:space="preserve">Discussion and limitations</w:t>
       </w:r>
-      <w:bookmarkEnd w:id="74"/>
+      <w:bookmarkEnd w:id="80"/>
+    </w:p>
+    <w:p>
+      <w:pPr>
+        <w:pStyle w:val="Heading2"/>
+      </w:pPr>
+      <w:bookmarkStart w:id="81" w:name="_88cd9a0f15c5b67eb3ec9a07a146442c5817f52"/>
+      <w:r>
+        <w:t xml:space="preserve">Matched-coverage robustness.</w:t>
+      </w:r>
+      <w:bookmarkEnd w:id="81"/>
     </w:p>
     <w:p>
       <w:pPr>
         <w:pStyle w:val="FirstParagraph"/>
       </w:pPr>
+      <w:r>
+        <w:t xml:space="preserve">At matched coverage, the selective gain survives comparison with simpler abstention rules</w:t>
+      </w:r>
+      <w:r>
+        <w:t xml:space="preserve"> </w:t>
+      </w:r>
+      <w:r>
+        <w:t xml:space="preserve">based on model confidence. Using 3</w:t>
+      </w:r>
+      <w:r>
+        <w:t xml:space="preserve">,</w:t>
+      </w:r>
+      <w:r>
+        <w:t xml:space="preserve">000 bootstrap resamples, the confidence-based</w:t>
+      </w:r>
+      <w:r>
+        <w:t xml:space="preserve"> </w:t>
+      </w:r>
+      <w:r>
+        <w:t xml:space="preserve">comparison has a confidence interval that excludes zero, while the ablation removes the</w:t>
+      </w:r>
+      <w:r>
+        <w:t xml:space="preserve"> </w:t>
+      </w:r>
+      <w:r>
+        <w:t xml:space="preserve">agreement feature and loses the observed advantage. This result supports the interpretation</w:t>
+      </w:r>
+      <w:r>
+        <w:t xml:space="preserve"> </w:t>
+      </w:r>
+      <w:r>
+        <w:t xml:space="preserve">that agreement among executable candidates, rather than confidence alone, supplies the</w:t>
+      </w:r>
+      <w:r>
+        <w:t xml:space="preserve"> </w:t>
+      </w:r>
+      <w:r>
+        <w:t xml:space="preserve">useful decision-level trust signal.</w:t>
+      </w:r>
+      <w:r>
+        <w:t xml:space="preserve"> </w:t>
+      </w:r>
       <w:r>
         <w:rPr>
           <w:b/>
@@ -8205,11 +8132,11 @@
       <w:pPr>
         <w:pStyle w:val="Heading1"/>
       </w:pPr>
-      <w:bookmarkStart w:id="75" w:name="_conclusion"/>
+      <w:bookmarkStart w:id="82" w:name="_conclusion"/>
       <w:r>
         <w:t xml:space="preserve">Conclusion</w:t>
       </w:r>
-      <w:bookmarkEnd w:id="75"/>
+      <w:bookmarkEnd w:id="82"/>
     </w:p>
     <w:p>
       <w:pPr>
@@ -9030,6 +8957,25 @@
         <w:t xml:space="preserve"> </w:t>
       </w:r>
       <w:r>
+        <w:t xml:space="preserve">A. Taubenfeld</w:t>
+      </w:r>
+      <w:r>
+        <w:t xml:space="preserve"> </w:t>
+      </w:r>
+      <w:r>
+        <w:rPr>
+          <w:i/>
+          <w:iCs/>
+        </w:rPr>
+        <w:t xml:space="preserve">et al.</w:t>
+      </w:r>
+      <w:r>
+        <w:t xml:space="preserve">,</w:t>
+      </w:r>
+      <w:r>
+        <w:t xml:space="preserve"> </w:t>
+      </w:r>
+      <w:r>
         <w:t xml:space="preserve">“Confidence Improves Self-Consistency in LLMs,”</w:t>
       </w:r>
       <w:r>
@@ -9042,7 +8988,13 @@
         <w:t xml:space="preserve"> </w:t>
       </w:r>
       <w:r>
-        <w:t xml:space="preserve">“Second Guess: Two-Pass Answer-Stability Abstention for Small-Language-Model MCQ,”</w:t>
+        <w:t xml:space="preserve">A. V. Aravindan and M. Kejriwal,</w:t>
+      </w:r>
+      <w:r>
+        <w:t xml:space="preserve"> </w:t>
+      </w:r>
+      <w:r>
+        <w:t xml:space="preserve">“Second Guess: Detecting Uncertainty Through Abstention and Answer Stability in Small Language Models,”</w:t>
       </w:r>
       <w:r>
         <w:t xml:space="preserve"> </w:t>
@@ -9054,7 +9006,26 @@
         <w:t xml:space="preserve"> </w:t>
       </w:r>
       <w:r>
-        <w:t xml:space="preserve">“SConU: Selective Conformal Uncertainty Estimation for Language Models,”</w:t>
+        <w:t xml:space="preserve">Z. Wang</w:t>
+      </w:r>
+      <w:r>
+        <w:t xml:space="preserve"> </w:t>
+      </w:r>
+      <w:r>
+        <w:rPr>
+          <w:i/>
+          <w:iCs/>
+        </w:rPr>
+        <w:t xml:space="preserve">et al.</w:t>
+      </w:r>
+      <w:r>
+        <w:t xml:space="preserve">,</w:t>
+      </w:r>
+      <w:r>
+        <w:t xml:space="preserve"> </w:t>
+      </w:r>
+      <w:r>
+        <w:t xml:space="preserve">“SConU: Selective Conformal Uncertainty in Large Language Models,”</w:t>
       </w:r>
       <w:r>
         <w:t xml:space="preserve"> </w:t>
@@ -9066,7 +9037,26 @@
         <w:t xml:space="preserve"> </w:t>
       </w:r>
       <w:r>
-        <w:t xml:space="preserve">“Linear Expectation Constraints for Selection-Conditioned Risk Control,”</w:t>
+        <w:t xml:space="preserve">Z. Wang</w:t>
+      </w:r>
+      <w:r>
+        <w:t xml:space="preserve"> </w:t>
+      </w:r>
+      <w:r>
+        <w:rPr>
+          <w:i/>
+          <w:iCs/>
+        </w:rPr>
+        <w:t xml:space="preserve">et al.</w:t>
+      </w:r>
+      <w:r>
+        <w:t xml:space="preserve">,</w:t>
+      </w:r>
+      <w:r>
+        <w:t xml:space="preserve"> </w:t>
+      </w:r>
+      <w:r>
+        <w:t xml:space="preserve">“LEC: Linear Expectation Constraints for Selection-Conditioned Risk Control in Selective Prediction and Routing Systems,”</w:t>
       </w:r>
       <w:r>
         <w:t xml:space="preserve"> </w:t>
@@ -9078,13 +9068,51 @@
         <w:t xml:space="preserve"> </w:t>
       </w:r>
       <w:r>
-        <w:t xml:space="preserve">“ASPIRE: Adaptation with Self-Evaluation for Selective Prediction of LLMs,”</w:t>
-      </w:r>
-      <w:r>
-        <w:t xml:space="preserve"> </w:t>
-      </w:r>
-      <w:r>
-        <w:t xml:space="preserve">arXiv:2310.11689, 2023.</w:t>
+        <w:t xml:space="preserve">J. Chen</w:t>
+      </w:r>
+      <w:r>
+        <w:t xml:space="preserve"> </w:t>
+      </w:r>
+      <w:r>
+        <w:rPr>
+          <w:i/>
+          <w:iCs/>
+        </w:rPr>
+        <w:t xml:space="preserve">et al.</w:t>
+      </w:r>
+      <w:r>
+        <w:t xml:space="preserve">,</w:t>
+      </w:r>
+      <w:r>
+        <w:t xml:space="preserve"> </w:t>
+      </w:r>
+      <w:r>
+        <w:t xml:space="preserve">“Adaptation with Self-Evaluation to Improve Selective Prediction in LLMs,”</w:t>
+      </w:r>
+      <w:r>
+        <w:t xml:space="preserve"> </w:t>
+      </w:r>
+      <w:r>
+        <w:t xml:space="preserve">Findings of EMNLP, 2023 (arXiv:2310.11689).</w:t>
+      </w:r>
+      <w:r>
+        <w:t xml:space="preserve"> </w:t>
+      </w:r>
+      <w:r>
+        <w:t xml:space="preserve">C. Liu</w:t>
+      </w:r>
+      <w:r>
+        <w:t xml:space="preserve"> </w:t>
+      </w:r>
+      <w:r>
+        <w:rPr>
+          <w:i/>
+          <w:iCs/>
+        </w:rPr>
+        <w:t xml:space="preserve">et al.</w:t>
+      </w:r>
+      <w:r>
+        <w:t xml:space="preserve">,</w:t>
       </w:r>
       <w:r>
         <w:t xml:space="preserve"> </w:t>
@@ -9102,19 +9130,26 @@
         <w:t xml:space="preserve"> </w:t>
       </w:r>
       <w:r>
-        <w:t xml:space="preserve">“Graph-Bounded Financial Reasoning with Safe Abstention,”</w:t>
-      </w:r>
-      <w:r>
-        <w:t xml:space="preserve"> </w:t>
-      </w:r>
-      <w:r>
-        <w:t xml:space="preserve">2026.</w:t>
-      </w:r>
-      <w:r>
-        <w:t xml:space="preserve"> </w:t>
-      </w:r>
-      <w:r>
-        <w:t xml:space="preserve">“FinChain: Verifiable Chain-of-Thought Reasoning in Finance,”</w:t>
+        <w:t xml:space="preserve">Z. Xie</w:t>
+      </w:r>
+      <w:r>
+        <w:t xml:space="preserve"> </w:t>
+      </w:r>
+      <w:r>
+        <w:rPr>
+          <w:i/>
+          <w:iCs/>
+        </w:rPr>
+        <w:t xml:space="preserve">et al.</w:t>
+      </w:r>
+      <w:r>
+        <w:t xml:space="preserve">,</w:t>
+      </w:r>
+      <w:r>
+        <w:t xml:space="preserve"> </w:t>
+      </w:r>
+      <w:r>
+        <w:t xml:space="preserve">“FinChain: A Symbolic Benchmark for Verifiable Chain-of-Thought Financial Reasoning,”</w:t>
       </w:r>
       <w:r>
         <w:t xml:space="preserve"> </w:t>

</xml_diff>